<commit_message>
Generation V2: integrate company and seller signature placeholders
</commit_message>
<xml_diff>
--- a/templates/AIF.docx
+++ b/templates/AIF.docx
@@ -1,6 +1,6 @@
 
 <file path=word/document.xml><?xml version="1.0" encoding="utf-8"?>
-<w:document xmlns:wpc="http://schemas.microsoft.com/office/word/2010/wordprocessingCanvas" xmlns:cx="http://schemas.microsoft.com/office/drawing/2014/chartex" xmlns:cx1="http://schemas.microsoft.com/office/drawing/2015/9/8/chartex" xmlns:cx2="http://schemas.microsoft.com/office/drawing/2015/10/21/chartex" xmlns:cx3="http://schemas.microsoft.com/office/drawing/2016/5/9/chartex" xmlns:cx4="http://schemas.microsoft.com/office/drawing/2016/5/10/chartex" xmlns:cx5="http://schemas.microsoft.com/office/drawing/2016/5/11/chartex" xmlns:cx6="http://schemas.microsoft.com/office/drawing/2016/5/12/chartex" xmlns:cx7="http://schemas.microsoft.com/office/drawing/2016/5/13/chartex" xmlns:cx8="http://schemas.microsoft.com/office/drawing/2016/5/14/chartex" xmlns:mc="http://schemas.openxmlformats.org/markup-compatibility/2006" xmlns:m="http://schemas.openxmlformats.org/officeDocument/2006/math" xmlns:aink="http://schemas.microsoft.com/office/drawing/2016/ink" xmlns:am3d="http://schemas.microsoft.com/office/drawing/2017/model3d" xmlns:oel="http://schemas.microsoft.com/office/2019/extlst" xmlns:r="http://schemas.openxmlformats.org/officeDocument/2006/relationships" xmlns:wp14="http://schemas.microsoft.com/office/word/2010/wordprocessingDrawing" xmlns:wp="http://schemas.openxmlformats.org/drawingml/2006/wordprocessingDrawing" xmlns:wpg="http://schemas.microsoft.com/office/word/2010/wordprocessingGroup" xmlns:wpi="http://schemas.microsoft.com/office/word/2010/wordprocessingInk" xmlns:wps="http://schemas.microsoft.com/office/word/2010/wordprocessingShape" xmlns:o="urn:schemas-microsoft-com:office:office" xmlns:v="urn:schemas-microsoft-com:vml" xmlns:w10="urn:schemas-microsoft-com:office:word" xmlns:w="http://schemas.openxmlformats.org/wordprocessingml/2006/main" xmlns:w14="http://schemas.microsoft.com/office/word/2010/wordml" xmlns:w15="http://schemas.microsoft.com/office/word/2012/wordml" xmlns:w16cex="http://schemas.microsoft.com/office/word/2018/wordml/cex" xmlns:w16cid="http://schemas.microsoft.com/office/word/2016/wordml/cid" xmlns:w16="http://schemas.microsoft.com/office/word/2018/wordml" xmlns:w16sdtdh="http://schemas.microsoft.com/office/word/2020/wordml/sdtdatahash" xmlns:w16sdtfl="http://schemas.microsoft.com/office/word/2024/wordml/sdtformatlock" xmlns:w16se="http://schemas.microsoft.com/office/word/2015/wordml/symex" xmlns:w16du="http://schemas.microsoft.com/office/word/2023/wordml/word16du" xmlns:wne="http://schemas.microsoft.com/office/word/2006/wordml" mc:Ignorable="w14 w15 w16se w16cid w16 w16cex w16sdtdh w16sdtfl w16du wp14">
+<w:document xmlns:mc="http://schemas.openxmlformats.org/markup-compatibility/2006" xmlns:w="http://schemas.openxmlformats.org/wordprocessingml/2006/main" xmlns:w14="http://schemas.microsoft.com/office/word/2010/wordml" mc:Ignorable="w14 w15 w16se w16cid w16 w16cex w16sdtdh w16sdtfl w16du wp14">
   <w:body>
     <w:p>
       <w:pPr>
@@ -77,168 +77,8 @@
       </w:pPr>
     </w:p>
     <w:p>
-      <w:pPr>
-        <w:pStyle w:val="BodyText"/>
-        <w:tabs>
-          <w:tab w:val="left" w:pos="7185"/>
-        </w:tabs>
-        <w:spacing w:before="0"/>
-        <w:ind w:left="13" w:right="272"/>
-        <w:jc w:val="both"/>
-      </w:pPr>
-      <w:r>
-        <w:t>BE IT ACKNOWLEDGED that l/we</w:t>
-      </w:r>
-      <w:r>
-        <w:rPr>
-          <w:spacing w:val="45"/>
-        </w:rPr>
-        <w:t xml:space="preserve"> </w:t>
-      </w:r>
-      <w:r>
-        <w:rPr>
-          <w:rFonts w:ascii="Times New Roman" w:hAnsi="Times New Roman"/>
-          <w:u w:val="single"/>
-        </w:rPr>
-        <w:tab/>
-      </w:r>
-      <w:r>
-        <w:rPr>
-          <w:rFonts w:ascii="Times New Roman" w:hAnsi="Times New Roman"/>
-          <w:spacing w:val="-12"/>
-        </w:rPr>
-        <w:t xml:space="preserve"> </w:t>
-      </w:r>
-      <w:r>
-        <w:t>the "Seller", do</w:t>
-      </w:r>
-      <w:r>
-        <w:rPr>
-          <w:spacing w:val="-4"/>
-        </w:rPr>
-        <w:t xml:space="preserve"> </w:t>
-      </w:r>
-      <w:r>
-        <w:t>hereby</w:t>
-      </w:r>
-      <w:r>
-        <w:rPr>
-          <w:spacing w:val="-4"/>
-        </w:rPr>
-        <w:t xml:space="preserve"> </w:t>
-      </w:r>
-      <w:r>
-        <w:t>grant</w:t>
-      </w:r>
-      <w:r>
-        <w:rPr>
-          <w:spacing w:val="-3"/>
-        </w:rPr>
-        <w:t xml:space="preserve"> </w:t>
-      </w:r>
-      <w:r>
-        <w:t>a</w:t>
-      </w:r>
-      <w:r>
-        <w:rPr>
-          <w:spacing w:val="-4"/>
-        </w:rPr>
-        <w:t xml:space="preserve"> </w:t>
-      </w:r>
-      <w:r>
-        <w:t>limited</w:t>
-      </w:r>
-      <w:r>
-        <w:rPr>
-          <w:spacing w:val="-4"/>
-        </w:rPr>
-        <w:t xml:space="preserve"> </w:t>
-      </w:r>
-      <w:r>
-        <w:t>and</w:t>
-      </w:r>
-      <w:r>
-        <w:rPr>
-          <w:spacing w:val="-4"/>
-        </w:rPr>
-        <w:t xml:space="preserve"> </w:t>
-      </w:r>
-      <w:r>
-        <w:t>specific</w:t>
-      </w:r>
-      <w:r>
-        <w:rPr>
-          <w:spacing w:val="-4"/>
-        </w:rPr>
-        <w:t xml:space="preserve"> </w:t>
-      </w:r>
-      <w:r>
-        <w:t>authorization</w:t>
-      </w:r>
-      <w:r>
-        <w:rPr>
-          <w:spacing w:val="-3"/>
-        </w:rPr>
-        <w:t xml:space="preserve"> </w:t>
-      </w:r>
-      <w:r>
-        <w:t>to</w:t>
-      </w:r>
-      <w:r>
-        <w:rPr>
-          <w:spacing w:val="-4"/>
-        </w:rPr>
-        <w:t xml:space="preserve"> </w:t>
-      </w:r>
-      <w:r>
-        <w:t>sign</w:t>
-      </w:r>
-      <w:r>
-        <w:rPr>
-          <w:spacing w:val="80"/>
-        </w:rPr>
-        <w:t xml:space="preserve"> </w:t>
-      </w:r>
-      <w:r>
-        <w:t xml:space="preserve">Mohamed </w:t>
-      </w:r>
-      <w:proofErr w:type="spellStart"/>
-      <w:r>
-        <w:t>M</w:t>
-      </w:r>
-      <w:r>
-        <w:t>a</w:t>
-      </w:r>
-      <w:r>
-        <w:t>harem</w:t>
-      </w:r>
-      <w:proofErr w:type="spellEnd"/>
-      <w:r>
-        <w:rPr>
-          <w:spacing w:val="-5"/>
-        </w:rPr>
-        <w:t xml:space="preserve"> </w:t>
-      </w:r>
-      <w:r>
-        <w:t>–</w:t>
-      </w:r>
-      <w:r>
-        <w:rPr>
-          <w:spacing w:val="-4"/>
-        </w:rPr>
-        <w:t xml:space="preserve"> </w:t>
-      </w:r>
-      <w:r>
-        <w:t>Same Day Home Solutions LLC</w:t>
-      </w:r>
-      <w:r>
-        <w:rPr>
-          <w:spacing w:val="40"/>
-        </w:rPr>
-        <w:t xml:space="preserve"> </w:t>
-      </w:r>
-      <w:r>
-        <w:t>as my "Attorney-in-Fact".</w:t>
+      <w:r>
+        <w:t>BE IT ACKNOWLEDGED that l/we  the "Seller", do hereby grant a limited and specific authorization to sign {{COMPANY_OWNER}} – {{COMPANY_NAME}} as my "Attorney-in-Fact".</w:t>
       </w:r>
     </w:p>
     <w:p>
@@ -929,166 +769,16 @@
       </w:pPr>
     </w:p>
     <w:p>
-      <w:pPr>
-        <w:tabs>
-          <w:tab w:val="left" w:pos="2951"/>
-          <w:tab w:val="left" w:pos="6695"/>
-          <w:tab w:val="left" w:pos="8476"/>
-        </w:tabs>
-        <w:ind w:left="8"/>
+      <w:r>
         <w:rPr>
           <w:rFonts w:ascii="Times New Roman"/>
         </w:rPr>
-      </w:pPr>
-      <w:r>
-        <w:rPr>
-          <w:spacing w:val="-2"/>
-        </w:rPr>
-        <w:t>Name</w:t>
-      </w:r>
-      <w:proofErr w:type="gramStart"/>
-      <w:r>
-        <w:rPr>
-          <w:spacing w:val="-2"/>
-        </w:rPr>
-        <w:t xml:space="preserve">: </w:t>
-      </w:r>
-      <w:r>
-        <w:rPr>
-          <w:b/>
-          <w:spacing w:val="-17"/>
-          <w:position w:val="2"/>
-          <w:u w:val="single"/>
-        </w:rPr>
-        <w:t xml:space="preserve"> </w:t>
-      </w:r>
-      <w:r>
-        <w:rPr>
-          <w:b/>
-          <w:spacing w:val="-2"/>
-          <w:position w:val="2"/>
-          <w:u w:val="single"/>
-        </w:rPr>
-        <w:t>{</w:t>
-      </w:r>
-      <w:proofErr w:type="gramEnd"/>
-      <w:r>
-        <w:rPr>
-          <w:b/>
-          <w:spacing w:val="-2"/>
-          <w:position w:val="2"/>
-          <w:u w:val="single"/>
-        </w:rPr>
-        <w:t>{SELLER_NAME}}</w:t>
-      </w:r>
-      <w:r>
-        <w:rPr>
-          <w:b/>
-          <w:position w:val="2"/>
-          <w:u w:val="single"/>
-        </w:rPr>
-        <w:tab/>
-      </w:r>
-      <w:r>
-        <w:rPr>
-          <w:b/>
-          <w:position w:val="2"/>
-        </w:rPr>
-        <w:t xml:space="preserve"> </w:t>
-      </w:r>
-      <w:r>
-        <w:t xml:space="preserve">Signature: </w:t>
-      </w:r>
-      <w:r>
-        <w:rPr>
-          <w:rFonts w:ascii="Times New Roman"/>
-          <w:u w:val="single"/>
-        </w:rPr>
-        <w:tab/>
-      </w:r>
-      <w:r>
-        <w:rPr>
-          <w:rFonts w:ascii="Times New Roman"/>
-        </w:rPr>
-        <w:t xml:space="preserve"> </w:t>
-      </w:r>
-      <w:r>
-        <w:t xml:space="preserve">Date: </w:t>
-      </w:r>
-      <w:r>
-        <w:rPr>
-          <w:rFonts w:ascii="Times New Roman"/>
-          <w:u w:val="single"/>
-        </w:rPr>
-        <w:tab/>
+        <w:t>Name: {{SELLER_SIGNATURE_1}} Signature:  Date:</w:t>
       </w:r>
     </w:p>
     <w:p>
-      <w:pPr>
-        <w:tabs>
-          <w:tab w:val="left" w:pos="2951"/>
-          <w:tab w:val="left" w:pos="6695"/>
-          <w:tab w:val="left" w:pos="8476"/>
-        </w:tabs>
-        <w:ind w:left="8"/>
-      </w:pPr>
-      <w:r>
-        <w:rPr>
-          <w:spacing w:val="-2"/>
-        </w:rPr>
-        <w:t xml:space="preserve">              Owners</w:t>
-      </w:r>
-      <w:r>
-        <w:rPr>
-          <w:spacing w:val="-5"/>
-        </w:rPr>
-        <w:t xml:space="preserve"> </w:t>
-      </w:r>
-      <w:r>
-        <w:rPr>
-          <w:spacing w:val="-4"/>
-        </w:rPr>
-        <w:t>Name</w:t>
-      </w:r>
-      <w:r>
-        <w:tab/>
-        <w:t xml:space="preserve">                    </w:t>
-      </w:r>
-      <w:r>
-        <w:rPr>
-          <w:spacing w:val="-2"/>
-        </w:rPr>
-        <w:t>Owners</w:t>
-      </w:r>
-      <w:r>
-        <w:rPr>
-          <w:spacing w:val="-3"/>
-        </w:rPr>
-        <w:t xml:space="preserve"> </w:t>
-      </w:r>
-      <w:r>
-        <w:rPr>
-          <w:spacing w:val="-2"/>
-        </w:rPr>
-        <w:t>Signature</w:t>
-      </w:r>
-      <w:r>
-        <w:rPr>
-          <w:spacing w:val="-2"/>
-        </w:rPr>
-        <w:br/>
-      </w:r>
-      <w:r>
-        <w:rPr>
-          <w:spacing w:val="-2"/>
-        </w:rPr>
-        <w:br/>
-      </w:r>
-      <w:r>
-        <w:rPr>
-          <w:spacing w:val="-2"/>
-        </w:rPr>
-        <w:br/>
+      <w:r>
+        <w:t>Owners Name: {{COMPANY_OWNER}}                    Owners Signature</w:t>
       </w:r>
     </w:p>
     <w:p/>

</xml_diff>

<commit_message>
Update AIF and PSA contract templates
</commit_message>
<xml_diff>
--- a/templates/AIF.docx
+++ b/templates/AIF.docx
@@ -1,6 +1,6 @@
 
 <file path=word/document.xml><?xml version="1.0" encoding="utf-8"?>
-<w:document xmlns:mc="http://schemas.openxmlformats.org/markup-compatibility/2006" xmlns:w="http://schemas.openxmlformats.org/wordprocessingml/2006/main" xmlns:w14="http://schemas.microsoft.com/office/word/2010/wordml" mc:Ignorable="w14 w15 w16se w16cid w16 w16cex w16sdtdh w16sdtfl w16du wp14">
+<w:document xmlns:wpc="http://schemas.microsoft.com/office/word/2010/wordprocessingCanvas" xmlns:cx="http://schemas.microsoft.com/office/drawing/2014/chartex" xmlns:cx1="http://schemas.microsoft.com/office/drawing/2015/9/8/chartex" xmlns:cx2="http://schemas.microsoft.com/office/drawing/2015/10/21/chartex" xmlns:cx3="http://schemas.microsoft.com/office/drawing/2016/5/9/chartex" xmlns:cx4="http://schemas.microsoft.com/office/drawing/2016/5/10/chartex" xmlns:cx5="http://schemas.microsoft.com/office/drawing/2016/5/11/chartex" xmlns:cx6="http://schemas.microsoft.com/office/drawing/2016/5/12/chartex" xmlns:cx7="http://schemas.microsoft.com/office/drawing/2016/5/13/chartex" xmlns:cx8="http://schemas.microsoft.com/office/drawing/2016/5/14/chartex" xmlns:mc="http://schemas.openxmlformats.org/markup-compatibility/2006" xmlns:m="http://schemas.openxmlformats.org/officeDocument/2006/math" xmlns:aink="http://schemas.microsoft.com/office/drawing/2016/ink" xmlns:am3d="http://schemas.microsoft.com/office/drawing/2017/model3d" xmlns:oel="http://schemas.microsoft.com/office/2019/extlst" xmlns:r="http://schemas.openxmlformats.org/officeDocument/2006/relationships" xmlns:wp14="http://schemas.microsoft.com/office/word/2010/wordprocessingDrawing" xmlns:wp="http://schemas.openxmlformats.org/drawingml/2006/wordprocessingDrawing" xmlns:wpg="http://schemas.microsoft.com/office/word/2010/wordprocessingGroup" xmlns:wpi="http://schemas.microsoft.com/office/word/2010/wordprocessingInk" xmlns:wps="http://schemas.microsoft.com/office/word/2010/wordprocessingShape" xmlns:o="urn:schemas-microsoft-com:office:office" xmlns:v="urn:schemas-microsoft-com:vml" xmlns:w10="urn:schemas-microsoft-com:office:word" xmlns:w="http://schemas.openxmlformats.org/wordprocessingml/2006/main" xmlns:w14="http://schemas.microsoft.com/office/word/2010/wordml" xmlns:w15="http://schemas.microsoft.com/office/word/2012/wordml" xmlns:w16cex="http://schemas.microsoft.com/office/word/2018/wordml/cex" xmlns:w16cid="http://schemas.microsoft.com/office/word/2016/wordml/cid" xmlns:w16="http://schemas.microsoft.com/office/word/2018/wordml" xmlns:w16sdtdh="http://schemas.microsoft.com/office/word/2020/wordml/sdtdatahash" xmlns:w16sdtfl="http://schemas.microsoft.com/office/word/2024/wordml/sdtformatlock" xmlns:w16se="http://schemas.microsoft.com/office/word/2015/wordml/symex" xmlns:w16du="http://schemas.microsoft.com/office/word/2023/wordml/word16du" xmlns:wne="http://schemas.microsoft.com/office/word/2006/wordml" mc:Ignorable="w14 w15 w16se w16cid w16 w16cex w16sdtdh w16sdtfl w16du wp14">
   <w:body>
     <w:p>
       <w:pPr>
@@ -764,24 +764,327 @@
     </w:p>
     <w:p>
       <w:pPr>
-        <w:pStyle w:val="BodyText"/>
-        <w:spacing w:before="249"/>
+        <w:tabs>
+          <w:tab w:val="left" w:pos="2951"/>
+          <w:tab w:val="left" w:pos="6695"/>
+          <w:tab w:val="left" w:pos="8476"/>
+        </w:tabs>
+        <w:ind w:left="8"/>
+        <w:rPr>
+          <w:rFonts w:ascii="Times New Roman"/>
+        </w:rPr>
       </w:pPr>
+      <w:r>
+        <w:br/>
+      </w:r>
+      <w:r>
+        <w:br/>
+      </w:r>
+      <w:r>
+        <w:rPr>
+          <w:spacing w:val="-2"/>
+        </w:rPr>
+        <w:t>Name</w:t>
+      </w:r>
+      <w:proofErr w:type="gramStart"/>
+      <w:r>
+        <w:rPr>
+          <w:spacing w:val="-2"/>
+        </w:rPr>
+        <w:t xml:space="preserve">: </w:t>
+      </w:r>
+      <w:r>
+        <w:rPr>
+          <w:b/>
+          <w:spacing w:val="-17"/>
+          <w:position w:val="2"/>
+          <w:u w:val="single"/>
+        </w:rPr>
+        <w:t xml:space="preserve"> </w:t>
+      </w:r>
+      <w:r>
+        <w:rPr>
+          <w:b/>
+          <w:spacing w:val="-2"/>
+          <w:position w:val="2"/>
+          <w:u w:val="single"/>
+        </w:rPr>
+        <w:t>{</w:t>
+      </w:r>
+      <w:proofErr w:type="gramEnd"/>
+      <w:r>
+        <w:rPr>
+          <w:b/>
+          <w:spacing w:val="-2"/>
+          <w:position w:val="2"/>
+          <w:u w:val="single"/>
+        </w:rPr>
+        <w:t>{SELLER_SIGNATURE_1</w:t>
+      </w:r>
+      <w:proofErr w:type="gramStart"/>
+      <w:r>
+        <w:rPr>
+          <w:b/>
+          <w:spacing w:val="-2"/>
+          <w:position w:val="2"/>
+          <w:u w:val="single"/>
+        </w:rPr>
+        <w:t xml:space="preserve">}}  </w:t>
+      </w:r>
+      <w:r>
+        <w:rPr>
+          <w:b/>
+          <w:position w:val="2"/>
+        </w:rPr>
+        <w:t xml:space="preserve"> </w:t>
+      </w:r>
+      <w:proofErr w:type="gramEnd"/>
+      <w:r>
+        <w:t xml:space="preserve">Signature: </w:t>
+      </w:r>
+      <w:r>
+        <w:rPr>
+          <w:rFonts w:ascii="Times New Roman"/>
+          <w:u w:val="single"/>
+        </w:rPr>
+        <w:tab/>
+      </w:r>
+      <w:r>
+        <w:rPr>
+          <w:rFonts w:ascii="Times New Roman"/>
+        </w:rPr>
+        <w:t xml:space="preserve"> </w:t>
+      </w:r>
+      <w:r>
+        <w:t xml:space="preserve">Date: </w:t>
+      </w:r>
+      <w:r>
+        <w:rPr>
+          <w:rFonts w:ascii="Times New Roman"/>
+          <w:u w:val="single"/>
+        </w:rPr>
+        <w:tab/>
+      </w:r>
     </w:p>
     <w:p>
-      <w:r>
+      <w:pPr>
+        <w:tabs>
+          <w:tab w:val="left" w:pos="2951"/>
+          <w:tab w:val="left" w:pos="6695"/>
+          <w:tab w:val="left" w:pos="8476"/>
+        </w:tabs>
+        <w:ind w:left="8"/>
         <w:rPr>
           <w:rFonts w:ascii="Times New Roman"/>
         </w:rPr>
-        <w:t>Name: {{SELLER_SIGNATURE_1}} Signature:  Date:</w:t>
+      </w:pPr>
+      <w:r>
+        <w:rPr>
+          <w:spacing w:val="-2"/>
+        </w:rPr>
+        <w:t xml:space="preserve">              Owners</w:t>
+      </w:r>
+      <w:r>
+        <w:rPr>
+          <w:spacing w:val="-5"/>
+        </w:rPr>
+        <w:t xml:space="preserve"> </w:t>
+      </w:r>
+      <w:r>
+        <w:rPr>
+          <w:spacing w:val="-4"/>
+        </w:rPr>
+        <w:t>Name</w:t>
+      </w:r>
+      <w:r>
+        <w:tab/>
+        <w:t xml:space="preserve">                    </w:t>
+      </w:r>
+      <w:r>
+        <w:rPr>
+          <w:spacing w:val="-2"/>
+        </w:rPr>
+        <w:t>Owners</w:t>
+      </w:r>
+      <w:r>
+        <w:rPr>
+          <w:spacing w:val="-3"/>
+        </w:rPr>
+        <w:t xml:space="preserve"> </w:t>
+      </w:r>
+      <w:r>
+        <w:rPr>
+          <w:spacing w:val="-2"/>
+        </w:rPr>
+        <w:t>Signature</w:t>
+      </w:r>
+      <w:r>
+        <w:rPr>
+          <w:spacing w:val="-2"/>
+        </w:rPr>
+        <w:br/>
+      </w:r>
+      <w:r>
+        <w:rPr>
+          <w:spacing w:val="-2"/>
+        </w:rPr>
+        <w:br/>
+      </w:r>
+      <w:r>
+        <w:rPr>
+          <w:spacing w:val="-2"/>
+        </w:rPr>
+        <w:br/>
+      </w:r>
+      <w:r>
+        <w:rPr>
+          <w:spacing w:val="-2"/>
+        </w:rPr>
+        <w:t>Name</w:t>
+      </w:r>
+      <w:proofErr w:type="gramStart"/>
+      <w:r>
+        <w:rPr>
+          <w:spacing w:val="-2"/>
+        </w:rPr>
+        <w:t xml:space="preserve">: </w:t>
+      </w:r>
+      <w:r>
+        <w:rPr>
+          <w:b/>
+          <w:spacing w:val="-17"/>
+          <w:position w:val="2"/>
+          <w:u w:val="single"/>
+        </w:rPr>
+        <w:t xml:space="preserve"> </w:t>
+      </w:r>
+      <w:r>
+        <w:rPr>
+          <w:b/>
+          <w:spacing w:val="-2"/>
+          <w:position w:val="2"/>
+          <w:u w:val="single"/>
+        </w:rPr>
+        <w:t>{</w:t>
+      </w:r>
+      <w:proofErr w:type="gramEnd"/>
+      <w:r>
+        <w:rPr>
+          <w:b/>
+          <w:spacing w:val="-2"/>
+          <w:position w:val="2"/>
+          <w:u w:val="single"/>
+        </w:rPr>
+        <w:t>{SELLER_SIGNATURE_</w:t>
+      </w:r>
+      <w:r>
+        <w:rPr>
+          <w:b/>
+          <w:spacing w:val="-2"/>
+          <w:position w:val="2"/>
+          <w:u w:val="single"/>
+        </w:rPr>
+        <w:t>2</w:t>
+      </w:r>
+      <w:proofErr w:type="gramStart"/>
+      <w:r>
+        <w:rPr>
+          <w:b/>
+          <w:spacing w:val="-2"/>
+          <w:position w:val="2"/>
+          <w:u w:val="single"/>
+        </w:rPr>
+        <w:t xml:space="preserve">}}  </w:t>
+      </w:r>
+      <w:r>
+        <w:rPr>
+          <w:b/>
+          <w:position w:val="2"/>
+        </w:rPr>
+        <w:t xml:space="preserve"> </w:t>
+      </w:r>
+      <w:proofErr w:type="gramEnd"/>
+      <w:r>
+        <w:t xml:space="preserve">Signature: </w:t>
+      </w:r>
+      <w:r>
+        <w:rPr>
+          <w:rFonts w:ascii="Times New Roman"/>
+          <w:u w:val="single"/>
+        </w:rPr>
+        <w:tab/>
+      </w:r>
+      <w:r>
+        <w:rPr>
+          <w:rFonts w:ascii="Times New Roman"/>
+        </w:rPr>
+        <w:t xml:space="preserve"> </w:t>
+      </w:r>
+      <w:r>
+        <w:t xml:space="preserve">Date: </w:t>
+      </w:r>
+      <w:r>
+        <w:rPr>
+          <w:rFonts w:ascii="Times New Roman"/>
+          <w:u w:val="single"/>
+        </w:rPr>
+        <w:tab/>
       </w:r>
     </w:p>
     <w:p>
       <w:r>
-        <w:t>Owners Name: {{COMPANY_OWNER}}                    Owners Signature</w:t>
+        <w:rPr>
+          <w:spacing w:val="-2"/>
+        </w:rPr>
+        <w:t xml:space="preserve">              Owners</w:t>
+      </w:r>
+      <w:r>
+        <w:rPr>
+          <w:spacing w:val="-5"/>
+        </w:rPr>
+        <w:t xml:space="preserve"> </w:t>
+      </w:r>
+      <w:r>
+        <w:rPr>
+          <w:spacing w:val="-4"/>
+        </w:rPr>
+        <w:t>Name</w:t>
+      </w:r>
+      <w:r>
+        <w:tab/>
+        <w:t xml:space="preserve">                    </w:t>
+      </w:r>
+      <w:r>
+        <w:rPr>
+          <w:spacing w:val="-2"/>
+        </w:rPr>
+        <w:t>Owners</w:t>
+      </w:r>
+      <w:r>
+        <w:rPr>
+          <w:spacing w:val="-3"/>
+        </w:rPr>
+        <w:t xml:space="preserve"> </w:t>
+      </w:r>
+      <w:r>
+        <w:rPr>
+          <w:spacing w:val="-2"/>
+        </w:rPr>
+        <w:t>Signature</w:t>
+      </w:r>
+      <w:r>
+        <w:rPr>
+          <w:spacing w:val="-2"/>
+        </w:rPr>
+        <w:br/>
+      </w:r>
+      <w:r>
+        <w:rPr>
+          <w:spacing w:val="-2"/>
+        </w:rPr>
+        <w:br/>
       </w:r>
     </w:p>
-    <w:p/>
     <w:sectPr>
       <w:type w:val="continuous"/>
       <w:pgSz w:w="11520" w:h="15120"/>
@@ -1238,7 +1541,6 @@
   <w:style w:type="character" w:default="1" w:styleId="DefaultParagraphFont">
     <w:name w:val="Default Paragraph Font"/>
     <w:uiPriority w:val="1"/>
-    <w:semiHidden/>
     <w:unhideWhenUsed/>
   </w:style>
   <w:style w:type="table" w:default="1" w:styleId="TableNormal">

</xml_diff>